<commit_message>
perf(diff): skip block-level marker placement for streams without markers (#1149)
Also regenerates the charter-collaboration golden redline: a bookmark whose
end Word wrote between paragraphs now keeps that end instead of being closed
zero-width at its start.
</commit_message>
<xml_diff>
--- a/TestFiles/HistoryArchive/charter-collaboration-comparison.docx
+++ b/TestFiles/HistoryArchive/charter-collaboration-comparison.docx
@@ -8192,7 +8192,6 @@
         <w:t xml:space="preserve"> </w:t>
       </w:r>
       <w:bookmarkStart w:name="_DV_C121" w:id="167"/>
-      <w:bookmarkEnd w:id="167"/>
     </w:p>
     <w:p>
       <w:pPr>
@@ -8546,6 +8545,7 @@
       <w:bookmarkEnd w:id="169"/>
       <w:bookmarkEnd w:id="170"/>
     </w:p>
+    <w:bookmarkEnd w:id="167"/>
     <w:p>
       <w:pPr>
         <w:pStyle w:val="Heading8"/>
@@ -18661,10 +18661,10 @@
         <w:footnoteReference w:id="86"/>
       </w:r>
       <w:bookmarkStart w:name="_cp_text_1_150" w:id="368"/>
-      <w:bookmarkEnd w:id="368"/>
       <w:bookmarkEnd w:id="366"/>
       <w:bookmarkEnd w:id="367"/>
     </w:p>
+    <w:bookmarkEnd w:id="368"/>
     <w:p>
       <w:pPr>
         <w:pStyle w:val="Heading5"/>

</xml_diff>